<commit_message>
fixed knitting issue - done for now
</commit_message>
<xml_diff>
--- a/docs/manuscript/master.docx
+++ b/docs/manuscript/master.docx
@@ -1851,7 +1851,102 @@
         <w:pStyle w:val="Textkrper"/>
       </w:pPr>
       <w:r>
-        <w:t xml:space="preserve">In a follow up study,</w:t>
+        <w:t xml:space="preserve">Two follow up studies also investigated the categorization of word initial stops /b/ and /p/ in Spanish-English bilinguals, and young Spanish-English and French-English bilinguals</w:t>
+      </w:r>
+      <w:r>
+        <w:t xml:space="preserve"> </w:t>
+      </w:r>
+      <w:r>
+        <w:t xml:space="preserve">(Gonzales, Byers-Heinlein, &amp; Lotto, 2019)</w:t>
+      </w:r>
+      <w:r>
+        <w:t xml:space="preserve">.</w:t>
+      </w:r>
+      <w:r>
+        <w:t xml:space="preserve"> </w:t>
+      </w:r>
+      <w:r>
+        <w:t xml:space="preserve">Differently from</w:t>
+      </w:r>
+      <w:r>
+        <w:t xml:space="preserve"> </w:t>
+      </w:r>
+      <w:r>
+        <w:t xml:space="preserve">Casillas and Simonet (2018)</w:t>
+      </w:r>
+      <w:r>
+        <w:t xml:space="preserve"> </w:t>
+      </w:r>
+      <w:r>
+        <w:t xml:space="preserve">and</w:t>
+      </w:r>
+      <w:r>
+        <w:t xml:space="preserve"> </w:t>
+      </w:r>
+      <w:r>
+        <w:t xml:space="preserve">Gonzales and Lotto (2013)</w:t>
+      </w:r>
+      <w:r>
+        <w:t xml:space="preserve">, these studies presented only the first syllable of the pafri-bafri continuum (paf-baf), and manipulated the participants’ language mode using conceptual cueing by telling participants they were listening to English or Spanish sounds, rather than perceptual cueing of the language specific rhotic sounds used by previous studies.</w:t>
+      </w:r>
+      <w:r>
+        <w:t xml:space="preserve"> </w:t>
+      </w:r>
+      <w:r>
+        <w:t xml:space="preserve">The results were consistent with previous studies; sufficiently proficient L2 Spanish speakers show language mode effects in their categorization of /p/ and /b/ on a VOT continuum, whether this is perceptually or conceptually cued.</w:t>
+      </w:r>
+    </w:p>
+    <w:p>
+      <w:pPr>
+        <w:pStyle w:val="Textkrper"/>
+      </w:pPr>
+      <w:r>
+        <w:t xml:space="preserve">The present study will inform models of L3 morphosyntax by examining categorical perception of bilinguals, and determining which of the language specific categorical (phonemic) boudaries Spanish/English bilinguals use to account for L3 sounds at their first exposure.</w:t>
+      </w:r>
+      <w:r>
+        <w:br/>
+      </w:r>
+      <w:r>
+        <w:t xml:space="preserve">Of the L3 morphosyntax models, only the TPM makes predictions in regard to phonological information.</w:t>
+      </w:r>
+      <w:r>
+        <w:t xml:space="preserve"> </w:t>
+      </w:r>
+      <w:r>
+        <w:t xml:space="preserve">Namely, it predicts that phonological or phonotactic cues are used to determine typological proximity when lexical overlap cannot readily be detected by the parser in the L3 input</w:t>
+      </w:r>
+      <w:r>
+        <w:t xml:space="preserve"> </w:t>
+      </w:r>
+      <w:r>
+        <w:t xml:space="preserve">(Rothman, 2015)</w:t>
+      </w:r>
+      <w:r>
+        <w:t xml:space="preserve">.</w:t>
+      </w:r>
+      <w:r>
+        <w:t xml:space="preserve"> </w:t>
+      </w:r>
+      <w:r>
+        <w:t xml:space="preserve">Since the precise nature of the use of phonological information in the TPM is unclear and untested, the present study presents the same two continua to participants in three different language modes in order to measure their categorization of what they believe to be English, Spanish, and a third language that they do not know.</w:t>
+      </w:r>
+    </w:p>
+    <w:p>
+      <w:pPr>
+        <w:pStyle w:val="berschrift2"/>
+      </w:pPr>
+      <w:bookmarkStart w:id="32" w:name="the-present-study"/>
+      <w:r>
+        <w:t xml:space="preserve">2.4	The Present Study</w:t>
+      </w:r>
+      <w:bookmarkEnd w:id="32"/>
+    </w:p>
+    <w:p>
+      <w:pPr>
+        <w:pStyle w:val="FirstParagraph"/>
+      </w:pPr>
+      <w:r>
+        <w:t xml:space="preserve">It is this conceptual cuing which resulted in a double phonemic boundary effect found by</w:t>
       </w:r>
       <w:r>
         <w:t xml:space="preserve"> </w:t>
@@ -1863,40 +1958,31 @@
         <w:t xml:space="preserve"> </w:t>
       </w:r>
       <w:r>
-        <w:t xml:space="preserve">also investigated Spanish English bilinguals’ categorization of word initial stops /b/ and /p/.</w:t>
-      </w:r>
-      <w:r>
-        <w:t xml:space="preserve"> </w:t>
-      </w:r>
-      <w:r>
-        <w:t xml:space="preserve">Differently from</w:t>
-      </w:r>
-      <w:r>
-        <w:t xml:space="preserve"> </w:t>
-      </w:r>
-      <w:r>
-        <w:t xml:space="preserve">Casillas and Simonet (2018)</w:t>
-      </w:r>
-      <w:r>
-        <w:t xml:space="preserve"> </w:t>
-      </w:r>
-      <w:r>
         <w:t xml:space="preserve">and</w:t>
       </w:r>
       <w:r>
         <w:t xml:space="preserve"> </w:t>
       </w:r>
       <w:r>
-        <w:t xml:space="preserve">Gonzales and Lotto (2013)</w:t>
-      </w:r>
-      <w:r>
-        <w:t xml:space="preserve">, this study presented only the first syllable of the pafri-bafri continuum (paf-baf), and manipulated the participants’ language mode using conceptual cueing by telling participants they were listening to English or Spanish sounds, rather than perceptual cueing of the language specific rhotic sounds used by previous studies.</w:t>
-      </w:r>
-      <w:r>
-        <w:t xml:space="preserve"> </w:t>
-      </w:r>
-      <w:r>
-        <w:t xml:space="preserve">The results were consistent with previous studies; sufficiently proficient L2 Spanish speakers show language mode effects in their categorization of /p/ and /b/ on a VOT continuum, whether this is perceptually or conceptually cued.</w:t>
+        <w:t xml:space="preserve">Gonzales et al. (2019)</w:t>
+      </w:r>
+      <w:r>
+        <w:t xml:space="preserve"> </w:t>
+      </w:r>
+      <w:r>
+        <w:t xml:space="preserve">that motivates the present study.</w:t>
+      </w:r>
+      <w:r>
+        <w:t xml:space="preserve"> </w:t>
+      </w:r>
+      <w:r>
+        <w:t xml:space="preserve">Since L3 learners likely detect phonetic cross-linguistic similarities in L3 input, the present study examines the role of conceptual cueing on L3 categorization at the first exposure to L3 input by omitting the presence of language specific segments from the stimuli.</w:t>
+      </w:r>
+      <w:r>
+        <w:t xml:space="preserve"> </w:t>
+      </w:r>
+      <w:r>
+        <w:t xml:space="preserve">Following the previous literature, which demonstrates that Spanish-English bilinguals categorize the same continuum of sounds differently depending upon the language they believe they are hearing, the present study both replicates these findings in the /p/-/b/ VOT continuum, extends them to a new F2 /i/-/u/ continuum, and examines whether one of these boundaries are used to categorize sounds in a new language, unknown to the speaker. Additionally, the present study is concerned with whether the third language has a well known historical relationship with previously known languages, and if this affects sound categorization. That is, whether participants who believe they are hearing French will be biased to categorize the continua as similar to their Spanish categorizations. This bias would be argued to be modulated by a metalinguistic knowledge of cross-linguistic similarity and historical relationship between Spanish and French.</w:t>
       </w:r>
     </w:p>
     <w:p>
@@ -1904,76 +1990,321 @@
         <w:pStyle w:val="Textkrper"/>
       </w:pPr>
       <w:r>
-        <w:t xml:space="preserve">The present study will inform models of L3 morphosyntax by examining categorical perception of bilinguals, and determining which of the language specific categorical (phonemic) boudaries Spanish/English bilinguals use to account for L3 sounds at their first exposure.</w:t>
+        <w:t xml:space="preserve">In addition to the potential metalinguistic effects on sound categorizations, the language specific acoustic correlates of distinctions between sounds is important, since it can better orient the expected directionality of language specific continua categorization. That is, the typical VOT range in both English and Spanish in which sounds are categorized as /p/ and /b/ is distinct. The difference between /p/ and /b/ in Spanish is one of</w:t>
+      </w:r>
+      <w:r>
+        <w:t xml:space="preserve"> </w:t>
+      </w:r>
+      <w:r>
+        <w:t xml:space="preserve">“</w:t>
+      </w:r>
+      <w:r>
+        <w:t xml:space="preserve">true voicing</w:t>
+      </w:r>
+      <w:r>
+        <w:t xml:space="preserve">”</w:t>
+      </w:r>
+      <w:r>
+        <w:t xml:space="preserve">, in which a positive VOT can be observed for the</w:t>
+      </w:r>
+      <w:r>
+        <w:t xml:space="preserve"> </w:t>
+      </w:r>
+      <w:r>
+        <w:t xml:space="preserve">“</w:t>
+      </w:r>
+      <w:r>
+        <w:t xml:space="preserve">voiceless</w:t>
+      </w:r>
+      <w:r>
+        <w:t xml:space="preserve">”</w:t>
+      </w:r>
+      <w:r>
+        <w:t xml:space="preserve"> </w:t>
+      </w:r>
+      <w:r>
+        <w:t xml:space="preserve">/p/, and a positive VOT is observed in the</w:t>
+      </w:r>
+      <w:r>
+        <w:t xml:space="preserve"> </w:t>
+      </w:r>
+      <w:r>
+        <w:t xml:space="preserve">“</w:t>
+      </w:r>
+      <w:r>
+        <w:t xml:space="preserve">voiced</w:t>
+      </w:r>
+      <w:r>
+        <w:t xml:space="preserve">”</w:t>
+      </w:r>
+      <w:r>
+        <w:t xml:space="preserve"> </w:t>
+      </w:r>
+      <w:r>
+        <w:t xml:space="preserve">/b/. English, on the other hand, has short and long lag distinction between /p/ and /b/ which is caused by a difference in aspiration. That is, both /p/ and /b/ may be phonetically voiceless (have a positive VOT), but nevertheless be categorized as voiced and voiceless by English speakers.</w:t>
       </w:r>
       <w:r>
         <w:br/>
       </w:r>
       <w:r>
-        <w:t xml:space="preserve">Of the L3 morphosyntax models, only the TPM makes predictions in regard to phonological information.</w:t>
-      </w:r>
-      <w:r>
-        <w:t xml:space="preserve"> </w:t>
-      </w:r>
-      <w:r>
-        <w:t xml:space="preserve">Namely, it predicts that phonological or phonotactic cues are used to determine typological proximity when lexical overlap cannot readily be detected by the parser in the L3 input</w:t>
-      </w:r>
-      <w:r>
-        <w:t xml:space="preserve"> </w:t>
-      </w:r>
-      <w:r>
-        <w:t xml:space="preserve">(Rothman, 2015)</w:t>
-      </w:r>
-      <w:r>
-        <w:t xml:space="preserve">.</w:t>
-      </w:r>
-      <w:r>
-        <w:t xml:space="preserve"> </w:t>
-      </w:r>
-      <w:r>
-        <w:t xml:space="preserve">Since the precise nature of the use of phonological information in the TPM is unclear and untested, the present study presents the same two continua to participants in three different language modes in order to measure their categorization of what they believe to be English, Spanish, and a third language that they do not know.</w:t>
-      </w:r>
+        <w:t xml:space="preserve">French is a true voicing language, which has the lead/short lag distinction</w:t>
+      </w:r>
+      <w:r>
+        <w:t xml:space="preserve"> </w:t>
+      </w:r>
+      <w:r>
+        <w:t xml:space="preserve">(Caramazza &amp; Yeni-Komshian, 1974; Lisker &amp; Abramson, 1964)</w:t>
+      </w:r>
+      <w:r>
+        <w:t xml:space="preserve">. Hungarian is considered to be a true-voicing language</w:t>
+      </w:r>
+      <w:r>
+        <w:t xml:space="preserve"> </w:t>
+      </w:r>
+      <w:r>
+        <w:t xml:space="preserve">(Lisker &amp; Abramson, 1964)</w:t>
+      </w:r>
+      <w:r>
+        <w:t xml:space="preserve">, in which a /b/-/p/ distinction is both phonetically and phonemically voiced or voiceless. In the case of the present study, the participants do not have any exposure to a third language, and the language-specific phonetic criteria for both voicing and vowel distinctions are of minimal importance, since the participants will not have had exposure to L3 input. The primary goal of the present study is to determine whether participants use the phonology of their L1 or their L2 when they categorize L3 continua by examining whether a participants’ responses in the perceptual task most closely resemble those in their L1, in their L2, or a third, unrelated categorization from the beginning.</w:t>
+      </w:r>
+    </w:p>
+    <w:p>
+      <w:pPr>
+        <w:pStyle w:val="Textkrper"/>
+      </w:pPr>
+      <w:r>
+        <w:t xml:space="preserve">As detailed previously, the entirety of the empirical support for the TPM comes from studies which involve two romance languages and English.</w:t>
+      </w:r>
+      <w:r>
+        <w:t xml:space="preserve"> </w:t>
+      </w:r>
+      <w:r>
+        <w:t xml:space="preserve">For this reason, the present study will include a group of this kind (the French L3 group), in which it is expected that the participants will account for these stimuli using their Spanish boundaries, which would partially support TPM, but provide an alternative motivation, namely top-down conceptual cueing, that is behind L3 users choice of language in situations in which typological relationship is evident.</w:t>
+      </w:r>
+      <w:r>
+        <w:t xml:space="preserve"> </w:t>
+      </w:r>
+      <w:r>
+        <w:t xml:space="preserve">Alternatively, an L3 Hungarian group will also be included, in which the typological relationship between the languages of this group (English, Spanish, and Hungarian) is unclear.</w:t>
+      </w:r>
+      <w:r>
+        <w:t xml:space="preserve"> </w:t>
+      </w:r>
+      <w:r>
+        <w:t xml:space="preserve">In this case, the categorization of what participants believe are Hungarian sounds does not have a clearly predictable pattern according to the TPM, and should result in the variable categorization of Hungarian as similar to either the L1 or the L2. Alternatively, it is possible that the Hungarian group will use their second language boundaries to categorize the L3 continua.</w:t>
+      </w:r>
+    </w:p>
+    <w:p>
+      <w:pPr>
+        <w:pStyle w:val="berschrift4"/>
+      </w:pPr>
+      <w:bookmarkStart w:id="33" w:name="research-questions"/>
+      <w:r>
+        <w:t xml:space="preserve">2.4.0.1	Research questions.</w:t>
+      </w:r>
+      <w:bookmarkEnd w:id="33"/>
+    </w:p>
+    <w:p>
+      <w:pPr>
+        <w:pStyle w:val="FirstParagraph"/>
+      </w:pPr>
+      <w:r>
+        <w:t xml:space="preserve">RQ1: Assuming that bilinguals display the same double phonemic boundary demonstrated in previous studies, will their categorizations of what they believe are the L3 continua resemble their categorizations of either their L1 or their L2?</w:t>
+      </w:r>
+      <w:r>
+        <w:t xml:space="preserve"> </w:t>
+      </w:r>
+      <w:r>
+        <w:t xml:space="preserve">I hypothesize that that the perception of the</w:t>
+      </w:r>
+      <w:r>
+        <w:t xml:space="preserve"> </w:t>
+      </w:r>
+      <w:r>
+        <w:t xml:space="preserve">“</w:t>
+      </w:r>
+      <w:r>
+        <w:t xml:space="preserve">third language</w:t>
+      </w:r>
+      <w:r>
+        <w:t xml:space="preserve">”</w:t>
+      </w:r>
+      <w:r>
+        <w:t xml:space="preserve"> </w:t>
+      </w:r>
+      <w:r>
+        <w:t xml:space="preserve">will be modulated by the participants’ order of acquisition in the event that language relatedness is unclear (the Hungarian group), and, alternatively, that participants’ perception will be modulated by their knowledge about the languages relatedness when a clear connection is made between languages at an individual level (the French group).</w:t>
+      </w:r>
+      <w:r>
+        <w:t xml:space="preserve"> </w:t>
+      </w:r>
+      <w:r>
+        <w:t xml:space="preserve">In particular, I predict that, when hearing the same continua, participants who are led to believe they are hearing French will perceive it more closely to Spanish than English (as demonstrated by their perceptual identification of the continua).</w:t>
+      </w:r>
+      <w:r>
+        <w:t xml:space="preserve"> </w:t>
+      </w:r>
+      <w:r>
+        <w:t xml:space="preserve">On the other hand, I predict that participants who believe they are hearing Hungarian will categorize sounds by using the phonemic boundary of their second language (L2).</w:t>
+      </w:r>
+      <w:r>
+        <w:t xml:space="preserve"> </w:t>
+      </w:r>
+      <w:r>
+        <w:t xml:space="preserve">These predictions are based on findings in previous research on L3 transfer which have demonstrated the default transfer of the L2 to the L3 in language combinations which do not involve romance languages.</w:t>
+      </w:r>
+    </w:p>
+    <w:p>
+      <w:pPr>
+        <w:pStyle w:val="Textkrper"/>
+      </w:pPr>
+      <w:r>
+        <w:t xml:space="preserve">RQ2: Will categorizations of what participants believe to be Hungarian or French result in different</w:t>
+      </w:r>
+      <w:r>
+        <w:t xml:space="preserve"> </w:t>
+      </w:r>
+      <w:r>
+        <w:t xml:space="preserve">“</w:t>
+      </w:r>
+      <w:r>
+        <w:t xml:space="preserve">language specific</w:t>
+      </w:r>
+      <w:r>
+        <w:t xml:space="preserve">”</w:t>
+      </w:r>
+      <w:r>
+        <w:t xml:space="preserve"> </w:t>
+      </w:r>
+      <w:r>
+        <w:t xml:space="preserve">categorization?</w:t>
+      </w:r>
+      <w:r>
+        <w:t xml:space="preserve"> </w:t>
+      </w:r>
+      <w:r>
+        <w:t xml:space="preserve">Previous research in L3 syntactic transfer</w:t>
+      </w:r>
+      <w:r>
+        <w:t xml:space="preserve"> </w:t>
+      </w:r>
+      <w:r>
+        <w:t xml:space="preserve">(Puig-Mayenco et al., 2020; Rothman, 2010, 2013)</w:t>
+      </w:r>
+      <w:r>
+        <w:t xml:space="preserve"> </w:t>
+      </w:r>
+      <w:r>
+        <w:t xml:space="preserve">has suggested that language transfer to the L3 is not determined by order of acquisition, but by typological similarity of the languages involved.</w:t>
+      </w:r>
+      <w:r>
+        <w:t xml:space="preserve"> </w:t>
+      </w:r>
+      <w:r>
+        <w:t xml:space="preserve">The present study offers an alternative account for the data in previous studies by suggesting that the results of previous studies can be explained by a conceptual priming effect that biases the L3 learner to utilize a particular system in order to parse L3 input.</w:t>
+      </w:r>
+      <w:r>
+        <w:t xml:space="preserve"> </w:t>
+      </w:r>
+      <w:r>
+        <w:t xml:space="preserve">Based on findings from a systematic review of empirical studies</w:t>
+      </w:r>
+      <w:r>
+        <w:t xml:space="preserve"> </w:t>
+      </w:r>
+      <w:r>
+        <w:t xml:space="preserve">(Puig-Mayenco et al., 2020)</w:t>
+      </w:r>
+      <w:r>
+        <w:t xml:space="preserve"> </w:t>
+      </w:r>
+      <w:r>
+        <w:t xml:space="preserve">in L3 transfer, it appears that there is no evidence of typological transfer outside of Romance language combinations when the third language is not a Romance language.</w:t>
+      </w:r>
+      <w:r>
+        <w:t xml:space="preserve"> </w:t>
+      </w:r>
+      <w:r>
+        <w:t xml:space="preserve">Based on this lack of empirical support for the TPM, the present study predicts that Spanish-English bilinguals who believe that they are hearing a romance L3 will be more likely to show bias to perceive it as Spanish-like, rather than English like.</w:t>
+      </w:r>
+      <w:r>
+        <w:t xml:space="preserve"> </w:t>
+      </w:r>
+      <w:r>
+        <w:t xml:space="preserve">The design of the present study allows for the teasing apart of typological similarity.</w:t>
+      </w:r>
+    </w:p>
+    <w:p>
+      <w:pPr>
+        <w:pStyle w:val="berschrift1"/>
+      </w:pPr>
+      <w:bookmarkStart w:id="34" w:name="methods"/>
+      <w:r>
+        <w:t xml:space="preserve">3	Methods</w:t>
+      </w:r>
+      <w:bookmarkEnd w:id="34"/>
     </w:p>
     <w:p>
       <w:pPr>
         <w:pStyle w:val="berschrift2"/>
       </w:pPr>
-      <w:bookmarkStart w:id="32" w:name="the-present-study"/>
-      <w:r>
-        <w:t xml:space="preserve">2.4	The Present Study</w:t>
-      </w:r>
-      <w:bookmarkEnd w:id="32"/>
+      <w:bookmarkStart w:id="35" w:name="participants"/>
+      <w:r>
+        <w:t xml:space="preserve">3.1	Participants</w:t>
+      </w:r>
+      <w:bookmarkEnd w:id="35"/>
     </w:p>
     <w:p>
       <w:pPr>
         <w:pStyle w:val="FirstParagraph"/>
       </w:pPr>
       <w:r>
-        <w:t xml:space="preserve">It is this conceptual cuing wihch resulted in a double phonemic boundary effect found by</w:t>
-      </w:r>
-      <w:r>
-        <w:t xml:space="preserve"> </w:t>
-      </w:r>
-      <w:r>
-        <w:t xml:space="preserve">Lozano-Argüelles et al. (2020)</w:t>
-      </w:r>
-      <w:r>
-        <w:t xml:space="preserve"> </w:t>
-      </w:r>
-      <w:r>
-        <w:t xml:space="preserve">that motivates the present study.</w:t>
-      </w:r>
-      <w:r>
-        <w:t xml:space="preserve"> </w:t>
-      </w:r>
-      <w:r>
-        <w:t xml:space="preserve">Since L3 learners likely detect phonetic cross-linguistic similarities in L3 input, the present study examines the role of conceptual cueing on L3 categorization at the first exposure to L3 input by omitting the presence of language specific segments from the stimuli.</w:t>
-      </w:r>
-      <w:r>
-        <w:t xml:space="preserve"> </w:t>
-      </w:r>
-      <w:r>
-        <w:t xml:space="preserve">Following the previous literature, which demonstrates that Spanish-English bilinguals categorize the same continuum of sounds differently depending upon the language they believe they are hearing, the present study both replicates these findings in the /p/-/b/ VOT continuum, extends them to a new F2 /i/-/u/ continuum, and examines whether one of these boundaries are used to categorize sounds in a new language, unknown to the speaker. Additionally, the present study is concerned with whether the third language has a well known historical relationship with previously known languages, and if this affects sound categorization. That is, whether participants who believe they are hearing French will be biased to categorize the continua as similar to their Spanish categorizations. This bias would be argued to be modulated by a metalinguistic knowledge of cross-linguistic similarity and historical relationship between Spanish and French.</w:t>
+        <w:t xml:space="preserve">A total of 100 participants took part in at least one experiment of the study and were recruited on the online platform Prolific. A total of 16 participants did not complete all blocks of the experiment, and their data was removed from the final analysis, resulting in a total of 84 participants who completed all portions of the experiment.</w:t>
+      </w:r>
+      <w:r>
+        <w:t xml:space="preserve"> </w:t>
+      </w:r>
+      <w:r>
+        <w:t xml:space="preserve">In order to tease apart L2 status effects from CLI brought about by typological similarity across languages, participants were recruited with both orders of acquisition.</w:t>
+      </w:r>
+      <w:r>
+        <w:t xml:space="preserve"> </w:t>
+      </w:r>
+      <w:r>
+        <w:t xml:space="preserve">That is, one group of participants spoke English as a first language and Spanish as a second language (the ES group, n = 36, and another group spoke Spanish as their first language and English as their second (the SE group, n = 55). Participants were screened prior to taking part in the study such that their age of onset was greater than 12 years old.</w:t>
+      </w:r>
+      <w:r>
+        <w:t xml:space="preserve"> </w:t>
+      </w:r>
+      <w:r>
+        <w:t xml:space="preserve">Then, in order to examine how the same groups of bilinguals categorize different L3s, the SE and ES group were then assigned either Hungarian (in the ES group, n = 17 and in the SE group, n =</w:t>
+      </w:r>
+      <w:r>
+        <w:t xml:space="preserve"> </w:t>
+      </w:r>
+      <w:r>
+        <w:t xml:space="preserve">31) or French (in the ES group, n = 17 and in the SE group, n = 18).</w:t>
+      </w:r>
+      <w:r>
+        <w:t xml:space="preserve"> </w:t>
+      </w:r>
+      <w:r>
+        <w:t xml:space="preserve">In order to assess whether participants were eligible to take part in the study, a screening process was carried out in prolific which involved the Language History Questionnaire</w:t>
+      </w:r>
+      <w:r>
+        <w:t xml:space="preserve"> </w:t>
+      </w:r>
+      <w:r>
+        <w:t xml:space="preserve">(Li, Zhang, Yu, &amp; Zhao, 2020)</w:t>
+      </w:r>
+      <w:r>
+        <w:t xml:space="preserve">, and a proficiency test in the participant’s L2.</w:t>
+      </w:r>
+      <w:r>
+        <w:t xml:space="preserve"> </w:t>
+      </w:r>
+      <w:r>
+        <w:t xml:space="preserve">Speakers who reported knowing a third language or who scored below 60% on the lexTALE proficiency test were deemed ineligible for the study, and were not permitted to continue.</w:t>
       </w:r>
     </w:p>
     <w:p>
@@ -1981,355 +2312,24 @@
         <w:pStyle w:val="Textkrper"/>
       </w:pPr>
       <w:r>
-        <w:t xml:space="preserve">In addition to the potential metalinguistic effects on sound categorizations, the language specific acoustic correlates of distinctions between sounds is important, since it can better orient the expected directionality of language specific continua categorization. That is, the typical VOT range in both English and Spanish in which sounds are categorized as /p/ and /b/ is distinct. The difference between /p/ and /b/ in Spanish is one of</w:t>
-      </w:r>
-      <w:r>
-        <w:t xml:space="preserve"> </w:t>
-      </w:r>
-      <w:r>
-        <w:t xml:space="preserve">“</w:t>
-      </w:r>
-      <w:r>
-        <w:t xml:space="preserve">true voicing</w:t>
-      </w:r>
-      <w:r>
-        <w:t xml:space="preserve">”</w:t>
-      </w:r>
-      <w:r>
-        <w:t xml:space="preserve">, in which a positive VOT can be observed for the</w:t>
-      </w:r>
-      <w:r>
-        <w:t xml:space="preserve"> </w:t>
-      </w:r>
-      <w:r>
-        <w:t xml:space="preserve">“</w:t>
-      </w:r>
-      <w:r>
-        <w:t xml:space="preserve">voiceless</w:t>
-      </w:r>
-      <w:r>
-        <w:t xml:space="preserve">”</w:t>
-      </w:r>
-      <w:r>
-        <w:t xml:space="preserve"> </w:t>
-      </w:r>
-      <w:r>
-        <w:t xml:space="preserve">/p/, and a positive VOT is observed in the</w:t>
-      </w:r>
-      <w:r>
-        <w:t xml:space="preserve"> </w:t>
-      </w:r>
-      <w:r>
-        <w:t xml:space="preserve">“</w:t>
-      </w:r>
-      <w:r>
-        <w:t xml:space="preserve">voiced</w:t>
-      </w:r>
-      <w:r>
-        <w:t xml:space="preserve">”</w:t>
-      </w:r>
-      <w:r>
-        <w:t xml:space="preserve"> </w:t>
-      </w:r>
-      <w:r>
-        <w:t xml:space="preserve">/b/. English, on the other hand, has short and long lag distinction between /p/ and /b/ which is caused by a difference in aspiration. That is, both /p/ and /b/ may be phonetically voiceless (have a positive VOT), but nevertheless be categorized as voiced and voiceless by English speakers.</w:t>
-      </w:r>
-      <w:r>
-        <w:br/>
-      </w:r>
-      <w:r>
-        <w:t xml:space="preserve">French is a true voicing language, which has the lead/short lag distinction</w:t>
-      </w:r>
-      <w:r>
-        <w:t xml:space="preserve"> </w:t>
-      </w:r>
-      <w:r>
-        <w:t xml:space="preserve">(Caramazza &amp; Yeni-Komshian, 1974; Lisker &amp; Abramson, 1964)</w:t>
-      </w:r>
-      <w:r>
-        <w:t xml:space="preserve">. Hungarian is considered to be a true-voicing language</w:t>
-      </w:r>
-      <w:r>
-        <w:t xml:space="preserve"> </w:t>
-      </w:r>
-      <w:r>
-        <w:t xml:space="preserve">(Lisker &amp; Abramson, 1964)</w:t>
-      </w:r>
-      <w:r>
-        <w:t xml:space="preserve">, in which a /b/-/p/ distinction is both phonetically and phonemically voiced or voiceless. In the case of the present study, the participants do not have any exposure to a third language, and the language-specific phonetic criteria for both voicing and vowel distinctions are of minimal importance, since the participants will not have had exposure to L3 input. The primary goal of the present study is to determine whether participants use the phonology of their L1 or their L2 when they categorize L3 continua by examining whether a participants’ responses in the perceptual task most closely resemble those in their L1, in their L2, or a third, unrelated categorization from the beginning.</w:t>
-      </w:r>
-    </w:p>
-    <w:p>
-      <w:pPr>
-        <w:pStyle w:val="Textkrper"/>
-      </w:pPr>
-      <w:r>
-        <w:t xml:space="preserve">As detailed previously, the entirety of the empirical support for the TPM comes from studies which involve two romance languages and English.</w:t>
-      </w:r>
-      <w:r>
-        <w:t xml:space="preserve"> </w:t>
-      </w:r>
-      <w:r>
-        <w:t xml:space="preserve">For this reason, the present study will include a group of this kind (the French L3 group), in which it is expected that the participants will account for these stimuli using their Spanish boundaries, which would partially support TPM, but provide an alternative motivation, namely top-down conceptual cueing, that is behind L3 users choice of language in situations in which typological relationship is evident.</w:t>
-      </w:r>
-      <w:r>
-        <w:t xml:space="preserve"> </w:t>
-      </w:r>
-      <w:r>
-        <w:t xml:space="preserve">Alternatively, an L3 Hungarian group will also be included, in which the typological relationship between the languages of this group (English, Spanish, and Hungarian) is unclear.</w:t>
-      </w:r>
-      <w:r>
-        <w:t xml:space="preserve"> </w:t>
-      </w:r>
-      <w:r>
-        <w:t xml:space="preserve">In this case, the categorization of what participants believe are Hungarian sounds does not have a clearly predictable pattern according to the TPM, and should result in the variable categorization of Hungarian as similar to either the L1 or the L2. Alternatively, it is possible that the Hungarian group will use their second language boundaries to categorize the L3 continua.</w:t>
-      </w:r>
-    </w:p>
-    <w:p>
-      <w:pPr>
-        <w:pStyle w:val="berschrift4"/>
-      </w:pPr>
-      <w:bookmarkStart w:id="33" w:name="research-questions"/>
-      <w:r>
-        <w:t xml:space="preserve">2.4.0.1	Research questions.</w:t>
-      </w:r>
-      <w:bookmarkEnd w:id="33"/>
+        <w:t xml:space="preserve">Additionally, participants who failed attention checks, chose the same answer for every trial, or generally displayed low effort on submissions were removed. The data of 5 participants were removed for English stops, 7 participants’ data Spanish stops were removed, and 4 participants in French stops, and 1 in Hungarian stops had their data removed.</w:t>
+      </w:r>
+    </w:p>
+    <w:p>
+      <w:pPr>
+        <w:pStyle w:val="berschrift2"/>
+      </w:pPr>
+      <w:bookmarkStart w:id="36" w:name="materials"/>
+      <w:r>
+        <w:t xml:space="preserve">3.2	Materials</w:t>
+      </w:r>
+      <w:bookmarkEnd w:id="36"/>
     </w:p>
     <w:p>
       <w:pPr>
         <w:pStyle w:val="FirstParagraph"/>
       </w:pPr>
       <w:r>
-        <w:t xml:space="preserve">RQ1: Assuming that bilinguals display the same double phonemic boundary demonstrated in previous studies, will their categorizations of what they believe are the L3 continua resemble their categorizations of either their L1 or their L2?</w:t>
-      </w:r>
-      <w:r>
-        <w:t xml:space="preserve"> </w:t>
-      </w:r>
-      <w:r>
-        <w:t xml:space="preserve">I hypothesize that that the perception of the</w:t>
-      </w:r>
-      <w:r>
-        <w:t xml:space="preserve"> </w:t>
-      </w:r>
-      <w:r>
-        <w:t xml:space="preserve">“</w:t>
-      </w:r>
-      <w:r>
-        <w:t xml:space="preserve">third language</w:t>
-      </w:r>
-      <w:r>
-        <w:t xml:space="preserve">”</w:t>
-      </w:r>
-      <w:r>
-        <w:t xml:space="preserve"> </w:t>
-      </w:r>
-      <w:r>
-        <w:t xml:space="preserve">will be modulated by the participants’ order of acquisition in the event that language relatedness is unclear (the Hungarian group), and, alternatively, that participants’ perception will be modulated by their knowledge about the languages relatedness when a clear connection is made between languages at an individual level (the French group).</w:t>
-      </w:r>
-      <w:r>
-        <w:t xml:space="preserve"> </w:t>
-      </w:r>
-      <w:r>
-        <w:t xml:space="preserve">In particular, I predict that, when hearing the same continua, participants who are led to believe they are hearing French will perceive it more closely to Spanish than English (as demonstrated by their perceptual identification of the continua).</w:t>
-      </w:r>
-      <w:r>
-        <w:t xml:space="preserve"> </w:t>
-      </w:r>
-      <w:r>
-        <w:t xml:space="preserve">On the other hand, I predict that participants who believe they are hearing Hungarian will categorize sounds by using the phonemic boundary of their second language (L2).</w:t>
-      </w:r>
-      <w:r>
-        <w:t xml:space="preserve"> </w:t>
-      </w:r>
-      <w:r>
-        <w:t xml:space="preserve">These predictions are based on findings in previous research on L3 transfer which have demonstrated the default transfer of the L2 to the L3 in language combinations which do not involve romance languages.</w:t>
-      </w:r>
-    </w:p>
-    <w:p>
-      <w:pPr>
-        <w:pStyle w:val="Textkrper"/>
-      </w:pPr>
-      <w:r>
-        <w:t xml:space="preserve">RQ2: Will categorizations of what participants believe to be Hungarian or French result in different</w:t>
-      </w:r>
-      <w:r>
-        <w:t xml:space="preserve"> </w:t>
-      </w:r>
-      <w:r>
-        <w:t xml:space="preserve">“</w:t>
-      </w:r>
-      <w:r>
-        <w:t xml:space="preserve">language specific</w:t>
-      </w:r>
-      <w:r>
-        <w:t xml:space="preserve">”</w:t>
-      </w:r>
-      <w:r>
-        <w:t xml:space="preserve"> </w:t>
-      </w:r>
-      <w:r>
-        <w:t xml:space="preserve">categorization?</w:t>
-      </w:r>
-      <w:r>
-        <w:t xml:space="preserve"> </w:t>
-      </w:r>
-      <w:r>
-        <w:t xml:space="preserve">Previous research in L3 syntactic transfer</w:t>
-      </w:r>
-      <w:r>
-        <w:t xml:space="preserve"> </w:t>
-      </w:r>
-      <w:r>
-        <w:t xml:space="preserve">(Puig-Mayenco et al., 2020; Rothman, 2010, 2013)</w:t>
-      </w:r>
-      <w:r>
-        <w:t xml:space="preserve"> </w:t>
-      </w:r>
-      <w:r>
-        <w:t xml:space="preserve">has suggested that language transfer to the L3 is not determined by order of acquisition, but by typological similarity of the languages involved.</w:t>
-      </w:r>
-      <w:r>
-        <w:t xml:space="preserve"> </w:t>
-      </w:r>
-      <w:r>
-        <w:t xml:space="preserve">The present study offers an alternative account for the data in previous studies by suggesting that the results of previous studies can be explained by a conceptual priming effect that biases the L3 learner to utilize a particular system in order to parse L3 input.</w:t>
-      </w:r>
-      <w:r>
-        <w:t xml:space="preserve"> </w:t>
-      </w:r>
-      <w:r>
-        <w:t xml:space="preserve">Based on findings from a systematic review of empirical studies</w:t>
-      </w:r>
-      <w:r>
-        <w:t xml:space="preserve"> </w:t>
-      </w:r>
-      <w:r>
-        <w:t xml:space="preserve">(Puig-Mayenco et al., 2020)</w:t>
-      </w:r>
-      <w:r>
-        <w:t xml:space="preserve"> </w:t>
-      </w:r>
-      <w:r>
-        <w:t xml:space="preserve">in L3 transfer, it appears that there is no evidence of typological transfer outside of Romance language combinations when the third language is not a Romance language.</w:t>
-      </w:r>
-      <w:r>
-        <w:t xml:space="preserve"> </w:t>
-      </w:r>
-      <w:r>
-        <w:t xml:space="preserve">Based on this lack of empirical support for the TPM, the present study predicts that Spanish-English bilinguals who believe that they are hearing a romance L3 will be more likely to show bias to perceive it as Spanish-like, rather than English like.</w:t>
-      </w:r>
-      <w:r>
-        <w:t xml:space="preserve"> </w:t>
-      </w:r>
-      <w:r>
-        <w:t xml:space="preserve">The design of the present study allows for the teasing apart of typological similarity.</w:t>
-      </w:r>
-    </w:p>
-    <w:p>
-      <w:pPr>
-        <w:pStyle w:val="berschrift1"/>
-      </w:pPr>
-      <w:bookmarkStart w:id="34" w:name="methods"/>
-      <w:r>
-        <w:t xml:space="preserve">3	Methods</w:t>
-      </w:r>
-      <w:bookmarkEnd w:id="34"/>
-    </w:p>
-    <w:p>
-      <w:pPr>
-        <w:pStyle w:val="berschrift2"/>
-      </w:pPr>
-      <w:bookmarkStart w:id="35" w:name="participants"/>
-      <w:r>
-        <w:t xml:space="preserve">3.1	Participants</w:t>
-      </w:r>
-      <w:bookmarkEnd w:id="35"/>
-    </w:p>
-    <w:p>
-      <w:pPr>
-        <w:pStyle w:val="FirstParagraph"/>
-      </w:pPr>
-      <w:r>
-        <w:t xml:space="preserve">A total of 100 participants took part in at least one experiment of the study and were recruited on the online platform Prolific. A total of 16 participants did not complete all blocks of the experiment, and their data was removed from the final analysis, resulting in a total of 84 participants who completed all portions of the experiment.</w:t>
-      </w:r>
-      <w:r>
-        <w:t xml:space="preserve"> </w:t>
-      </w:r>
-      <w:r>
-        <w:t xml:space="preserve">In order to tease apart L2 status effects from CLI brought about by typological similarity across languages, participants were recruited with both orders of acquisition.</w:t>
-      </w:r>
-      <w:r>
-        <w:t xml:space="preserve"> </w:t>
-      </w:r>
-      <w:r>
-        <w:t xml:space="preserve">That is, one group of participants spoke English as a first language and Spanish as a second language (the ES group, n = 36, and another group spoke Spanish as their first language and English as their second (the SE group, n = 55). Participants were screened prior to taking part in the study such that their age of onset was greater than 12 years old.</w:t>
-      </w:r>
-      <w:r>
-        <w:t xml:space="preserve"> </w:t>
-      </w:r>
-      <w:r>
-        <w:t xml:space="preserve">Then, in order to examine how the same groups of bilinguals categorize different L3s, the SE and ES group were then assigned either Hungarian (in the ES group, n = 17 and in the SE group, n =</w:t>
-      </w:r>
-      <w:r>
-        <w:t xml:space="preserve"> </w:t>
-      </w:r>
-      <w:r>
-        <w:t xml:space="preserve">31) or French (in the ES group, n = 17 and in the SE group, n = 18).</w:t>
-      </w:r>
-      <w:r>
-        <w:t xml:space="preserve"> </w:t>
-      </w:r>
-      <w:r>
-        <w:t xml:space="preserve">In order to assess whether participants were eligible to take part in the study, a screening process was carried out in prolific which involved the Language History Questionnaire</w:t>
-      </w:r>
-      <w:r>
-        <w:t xml:space="preserve"> </w:t>
-      </w:r>
-      <w:r>
-        <w:t xml:space="preserve">(</w:t>
-      </w:r>
-      <w:r>
-        <w:rPr>
-          <w:b/>
-        </w:rPr>
-        <w:t xml:space="preserve">???</w:t>
-      </w:r>
-      <w:r>
-        <w:t xml:space="preserve">)</w:t>
-      </w:r>
-      <w:r>
-        <w:t xml:space="preserve">, and a proficiency test in the participant’s L2.</w:t>
-      </w:r>
-      <w:r>
-        <w:t xml:space="preserve"> </w:t>
-      </w:r>
-      <w:r>
-        <w:t xml:space="preserve">Speakers who reported knowing a third language or who scored below 60% on the LEXtale proficiency test were deemed ineligible for the study, and were not permitted to continue.</w:t>
-      </w:r>
-    </w:p>
-    <w:p>
-      <w:pPr>
-        <w:pStyle w:val="Textkrper"/>
-      </w:pPr>
-      <w:r>
-        <w:t xml:space="preserve">Additionally, participants who failed attention checks, chose the same answer for every trial, or generally displayed low effort on submissions were removed. The data of 5 participants were removed for English stops, 7 participants’ data Spanish stops were removed, and 4 participants in French stops, and 1 in Hungarian stops had their data removed.</w:t>
-      </w:r>
-    </w:p>
-    <w:p>
-      <w:pPr>
-        <w:pStyle w:val="berschrift2"/>
-      </w:pPr>
-      <w:bookmarkStart w:id="36" w:name="materials"/>
-      <w:r>
-        <w:t xml:space="preserve">3.2	Materials</w:t>
-      </w:r>
-      <w:bookmarkEnd w:id="36"/>
-    </w:p>
-    <w:p>
-      <w:pPr>
-        <w:pStyle w:val="FirstParagraph"/>
-      </w:pPr>
-      <w:r>
         <w:t xml:space="preserve">The experiment was composed of 5 total blocks.</w:t>
       </w:r>
       <w:r>
@@ -2342,16 +2342,7 @@
         <w:t xml:space="preserve"> </w:t>
       </w:r>
       <w:r>
-        <w:t xml:space="preserve">(</w:t>
-      </w:r>
-      <w:r>
-        <w:rPr>
-          <w:b/>
-        </w:rPr>
-        <w:t xml:space="preserve">???</w:t>
-      </w:r>
-      <w:r>
-        <w:t xml:space="preserve">)</w:t>
+        <w:t xml:space="preserve">(Li et al., 2020)</w:t>
       </w:r>
       <w:r>
         <w:t xml:space="preserve"> </w:t>
@@ -2363,7 +2354,7 @@
         <w:t xml:space="preserve"> </w:t>
       </w:r>
       <w:r>
-        <w:t xml:space="preserve">The measure of L2 proficiency, the LEXtale</w:t>
+        <w:t xml:space="preserve">The measure of L2 proficiency, the lexTALE</w:t>
       </w:r>
       <w:r>
         <w:t xml:space="preserve"> </w:t>
@@ -2378,13 +2369,13 @@
         <w:t xml:space="preserve"> </w:t>
       </w:r>
       <w:r>
-        <w:t xml:space="preserve">The LEXtale is a lexical decision task in the L2 of the participant in which the participants are presented with either a word or a non-word, and they must decide whether the word presented is a real word or a non-word.</w:t>
-      </w:r>
-      <w:r>
-        <w:t xml:space="preserve"> </w:t>
-      </w:r>
-      <w:r>
-        <w:t xml:space="preserve">Both the Spanish and English versions are scored in the same manner, and allow for comparability of proficiency across groups. Both versions contain 60 words total, 40 of which are real words and 20 of which are non-words. A formula then calculates a score based on the percentage of real words correct plus the percentage of non-words correct divided by 2. Table 1 is a table of descriptive statistics which shows the mean LEXtale score per L1 group. As the table shows, the Spanish L1 group was more proficient in their L2 on average than the English L1 group. Figure 1 shows a graphical relationship of the distribution of proficiency scores per L1 group.</w:t>
+        <w:t xml:space="preserve">The lexTALE is a lexical decision task in the L2 of the participant in which the participants are presented with either a word or a non-word, and they must decide whether the word presented is a real word or a non-word.</w:t>
+      </w:r>
+      <w:r>
+        <w:t xml:space="preserve"> </w:t>
+      </w:r>
+      <w:r>
+        <w:t xml:space="preserve">Both the Spanish and English versions are scored in the same manner, and allow for comparability of proficiency across groups. Both versions contain 60 words total, 40 of which are real words and 20 of which are non-words. A formula then calculates a score based on the percentage of real words correct plus the percentage of non-words correct divided by 2. Table 1 is a table of descriptive statistics which shows the mean lexTALE score per L1 group. As the table shows, the Spanish L1 group was more proficient in their L2 on average than the English L1 group. Figure 1 shows a graphical relationship of the distribution of proficiency scores per L1 group.</w:t>
       </w:r>
     </w:p>
     <w:p>
@@ -2763,7 +2754,7 @@
         <w:t xml:space="preserve"> </w:t>
       </w:r>
       <w:r>
-        <w:t xml:space="preserve">(Lozano-Argüelles et al., 2020)</w:t>
+        <w:t xml:space="preserve">(Gonzales et al., 2019; Lozano-Argüelles et al., 2020)</w:t>
       </w:r>
       <w:r>
         <w:t xml:space="preserve"> </w:t>
@@ -3207,31 +3198,22 @@
         <w:pStyle w:val="FirstParagraph"/>
       </w:pPr>
       <w:r>
-        <w:t xml:space="preserve">All participants completed a total of five tasks, the Language History Questionnaire, the LEXtale proficiency test in their L2, and three two alternative forced choice tasks. First, the participants completed the Language History Questionnaire online</w:t>
-      </w:r>
-      <w:r>
-        <w:t xml:space="preserve"> </w:t>
-      </w:r>
-      <w:r>
-        <w:t xml:space="preserve">(</w:t>
-      </w:r>
-      <w:r>
-        <w:rPr>
-          <w:b/>
-        </w:rPr>
-        <w:t xml:space="preserve">???</w:t>
-      </w:r>
-      <w:r>
-        <w:t xml:space="preserve">)</w:t>
-      </w:r>
-      <w:r>
-        <w:t xml:space="preserve">, followed by the LEXtale proficiency test.</w:t>
-      </w:r>
-      <w:r>
-        <w:t xml:space="preserve"> </w:t>
-      </w:r>
-      <w:r>
-        <w:t xml:space="preserve">Following these two tasks used for screening, only those participants who did have knowledge of a third language and scored at least 60% on the LEXtale were deemed eligible and continued the experiment. This cutoff was chosen to focus the analysis on more proficient bilinguals, rather than demonstrate that increasing proficiency is correlated to a larger double phonemic boundary effect size, as has been found in previous studies</w:t>
+        <w:t xml:space="preserve">All participants completed a total of five tasks, the Language History Questionnaire, the lexTALE proficiency test in their L2, and three two alternative forced choice tasks. First, the participants completed the Language History Questionnaire online</w:t>
+      </w:r>
+      <w:r>
+        <w:t xml:space="preserve"> </w:t>
+      </w:r>
+      <w:r>
+        <w:t xml:space="preserve">(Li et al., 2020)</w:t>
+      </w:r>
+      <w:r>
+        <w:t xml:space="preserve">, followed by the lexTALE proficiency test.</w:t>
+      </w:r>
+      <w:r>
+        <w:t xml:space="preserve"> </w:t>
+      </w:r>
+      <w:r>
+        <w:t xml:space="preserve">Following these two tasks used for screening, only those participants who did have knowledge of a third language and scored at least 60% on the lexTALE were deemed eligible and continued the experiment. This cutoff was chosen to focus the analysis on more proficient bilinguals, rather than demonstrate that increasing proficiency is correlated to a larger double phonemic boundary effect size, as has been found in previous studies</w:t>
       </w:r>
       <w:r>
         <w:t xml:space="preserve"> </w:t>
@@ -3440,16 +3422,7 @@
         <w:t xml:space="preserve"> </w:t>
       </w:r>
       <w:r>
-        <w:t xml:space="preserve">(</w:t>
-      </w:r>
-      <w:r>
-        <w:rPr>
-          <w:b/>
-        </w:rPr>
-        <w:t xml:space="preserve">???</w:t>
-      </w:r>
-      <w:r>
-        <w:t xml:space="preserve">)</w:t>
+        <w:t xml:space="preserve">(R Core Team, 2018)</w:t>
       </w:r>
       <w:r>
         <w:t xml:space="preserve"> </w:t>
@@ -6618,7 +6591,7 @@
       </w:r>
       <w:bookmarkEnd w:id="65"/>
     </w:p>
-    <w:bookmarkStart w:id="165" w:name="refs"/>
+    <w:bookmarkStart w:id="170" w:name="refs"/>
     <w:bookmarkStart w:id="67" w:name="ref-abbes_acquisition_2016"/>
     <w:p>
       <w:pPr>
@@ -7373,7 +7346,41 @@
       </w:hyperlink>
     </w:p>
     <w:bookmarkEnd w:id="101"/>
-    <w:bookmarkStart w:id="103" w:name="ref-gonzales_bafri_2013"/>
+    <w:bookmarkStart w:id="102" w:name="ref-gonzales_how_2019"/>
+    <w:p>
+      <w:pPr>
+        <w:pStyle w:val="Literaturverzeichnis"/>
+      </w:pPr>
+      <w:r>
+        <w:t xml:space="preserve">Gonzales, K., Byers-Heinlein, K., &amp; Lotto, A. J. (2019). How bilinguals perceive speech depends on which language they think they’re hearing.</w:t>
+      </w:r>
+      <w:r>
+        <w:t xml:space="preserve"> </w:t>
+      </w:r>
+      <w:r>
+        <w:rPr>
+          <w:i/>
+        </w:rPr>
+        <w:t xml:space="preserve">Cognition</w:t>
+      </w:r>
+      <w:r>
+        <w:t xml:space="preserve">,</w:t>
+      </w:r>
+      <w:r>
+        <w:t xml:space="preserve"> </w:t>
+      </w:r>
+      <w:r>
+        <w:rPr>
+          <w:i/>
+        </w:rPr>
+        <w:t xml:space="preserve">182</w:t>
+      </w:r>
+      <w:r>
+        <w:t xml:space="preserve">, 318–330.</w:t>
+      </w:r>
+    </w:p>
+    <w:bookmarkEnd w:id="102"/>
+    <w:bookmarkStart w:id="104" w:name="ref-gonzales_bafri_2013"/>
     <w:p>
       <w:pPr>
         <w:pStyle w:val="Literaturverzeichnis"/>
@@ -7435,7 +7442,7 @@
       <w:r>
         <w:t xml:space="preserve"> </w:t>
       </w:r>
-      <w:hyperlink r:id="rId102">
+      <w:hyperlink r:id="rId103">
         <w:r>
           <w:rPr>
             <w:rStyle w:val="Hyperlink"/>
@@ -7444,8 +7451,8 @@
         </w:r>
       </w:hyperlink>
     </w:p>
-    <w:bookmarkEnd w:id="103"/>
-    <w:bookmarkStart w:id="105" w:name="ref-gut_cross-linguistic_2010"/>
+    <w:bookmarkEnd w:id="104"/>
+    <w:bookmarkStart w:id="106" w:name="ref-gut_cross-linguistic_2010"/>
     <w:p>
       <w:pPr>
         <w:pStyle w:val="Literaturverzeichnis"/>
@@ -7480,7 +7487,7 @@
       <w:r>
         <w:t xml:space="preserve"> </w:t>
       </w:r>
-      <w:hyperlink r:id="rId104">
+      <w:hyperlink r:id="rId105">
         <w:r>
           <w:rPr>
             <w:rStyle w:val="Hyperlink"/>
@@ -7489,8 +7496,8 @@
         </w:r>
       </w:hyperlink>
     </w:p>
-    <w:bookmarkEnd w:id="105"/>
-    <w:bookmarkStart w:id="106" w:name="ref-hammarberg_articulatory_1993"/>
+    <w:bookmarkEnd w:id="106"/>
+    <w:bookmarkStart w:id="107" w:name="ref-hammarberg_articulatory_1993"/>
     <w:p>
       <w:pPr>
         <w:pStyle w:val="Literaturverzeichnis"/>
@@ -7523,8 +7530,8 @@
         <w:t xml:space="preserve">, 61–67.</w:t>
       </w:r>
     </w:p>
-    <w:bookmarkEnd w:id="106"/>
-    <w:bookmarkStart w:id="108" w:name="ref-hammarberg_processes_2005"/>
+    <w:bookmarkEnd w:id="107"/>
+    <w:bookmarkStart w:id="109" w:name="ref-hammarberg_processes_2005"/>
     <w:p>
       <w:pPr>
         <w:pStyle w:val="Literaturverzeichnis"/>
@@ -7547,7 +7554,7 @@
       <w:r>
         <w:t xml:space="preserve"> </w:t>
       </w:r>
-      <w:hyperlink r:id="rId107">
+      <w:hyperlink r:id="rId108">
         <w:r>
           <w:rPr>
             <w:rStyle w:val="Hyperlink"/>
@@ -7556,8 +7563,8 @@
         </w:r>
       </w:hyperlink>
     </w:p>
-    <w:bookmarkEnd w:id="108"/>
-    <w:bookmarkStart w:id="110" w:name="ref-hazan_perception_1993"/>
+    <w:bookmarkEnd w:id="109"/>
+    <w:bookmarkStart w:id="111" w:name="ref-hazan_perception_1993"/>
     <w:p>
       <w:pPr>
         <w:pStyle w:val="Literaturverzeichnis"/>
@@ -7592,7 +7599,7 @@
       <w:r>
         <w:t xml:space="preserve"> </w:t>
       </w:r>
-      <w:hyperlink r:id="rId109">
+      <w:hyperlink r:id="rId110">
         <w:r>
           <w:rPr>
             <w:rStyle w:val="Hyperlink"/>
@@ -7601,8 +7608,8 @@
         </w:r>
       </w:hyperlink>
     </w:p>
-    <w:bookmarkEnd w:id="110"/>
-    <w:bookmarkStart w:id="112" w:name="ref-izura_lexical_2016"/>
+    <w:bookmarkEnd w:id="111"/>
+    <w:bookmarkStart w:id="113" w:name="ref-izura_lexical_2016"/>
     <w:p>
       <w:pPr>
         <w:pStyle w:val="Literaturverzeichnis"/>
@@ -7625,7 +7632,7 @@
       <w:r>
         <w:t xml:space="preserve"> </w:t>
       </w:r>
-      <w:hyperlink r:id="rId111">
+      <w:hyperlink r:id="rId112">
         <w:r>
           <w:rPr>
             <w:rStyle w:val="Hyperlink"/>
@@ -7634,8 +7641,8 @@
         </w:r>
       </w:hyperlink>
     </w:p>
-    <w:bookmarkEnd w:id="112"/>
-    <w:bookmarkStart w:id="113" w:name="ref-kamiyama_acquisition_2007"/>
+    <w:bookmarkEnd w:id="113"/>
+    <w:bookmarkStart w:id="114" w:name="ref-kamiyama_acquisition_2007"/>
     <w:p>
       <w:pPr>
         <w:pStyle w:val="Literaturverzeichnis"/>
@@ -7656,8 +7663,8 @@
         <w:t xml:space="preserve">. Freiburg, Germany.</w:t>
       </w:r>
     </w:p>
-    <w:bookmarkEnd w:id="113"/>
-    <w:bookmarkStart w:id="114" w:name="ref-kellerman_now_1983"/>
+    <w:bookmarkEnd w:id="114"/>
+    <w:bookmarkStart w:id="115" w:name="ref-kellerman_now_1983"/>
     <w:p>
       <w:pPr>
         <w:pStyle w:val="Literaturverzeichnis"/>
@@ -7681,8 +7688,8 @@
         <w:t xml:space="preserve">(pp. 112–134). Rowley, MA: Newbury House.</w:t>
       </w:r>
     </w:p>
-    <w:bookmarkEnd w:id="114"/>
-    <w:bookmarkStart w:id="116" w:name="ref-lemhofer_lexical_2016"/>
+    <w:bookmarkEnd w:id="115"/>
+    <w:bookmarkStart w:id="117" w:name="ref-lemhofer_lexical_2016"/>
     <w:p>
       <w:pPr>
         <w:pStyle w:val="Literaturverzeichnis"/>
@@ -7705,7 +7712,7 @@
       <w:r>
         <w:t xml:space="preserve"> </w:t>
       </w:r>
-      <w:hyperlink r:id="rId115">
+      <w:hyperlink r:id="rId116">
         <w:r>
           <w:rPr>
             <w:rStyle w:val="Hyperlink"/>
@@ -7714,8 +7721,53 @@
         </w:r>
       </w:hyperlink>
     </w:p>
-    <w:bookmarkEnd w:id="116"/>
-    <w:bookmarkStart w:id="118" w:name="ref-lisker_cross-language_1964"/>
+    <w:bookmarkEnd w:id="117"/>
+    <w:bookmarkStart w:id="119" w:name="ref-li_language_2020"/>
+    <w:p>
+      <w:pPr>
+        <w:pStyle w:val="Literaturverzeichnis"/>
+      </w:pPr>
+      <w:r>
+        <w:t xml:space="preserve">Li, P., Zhang, F., Yu, A., &amp; Zhao, X. (2020). Language history questionnaire (LHQ3): An enhanced tool for assessing multilingual experience.</w:t>
+      </w:r>
+      <w:r>
+        <w:t xml:space="preserve"> </w:t>
+      </w:r>
+      <w:r>
+        <w:rPr>
+          <w:i/>
+        </w:rPr>
+        <w:t xml:space="preserve">Bilingualism: Language and Cognition</w:t>
+      </w:r>
+      <w:r>
+        <w:t xml:space="preserve">,</w:t>
+      </w:r>
+      <w:r>
+        <w:t xml:space="preserve"> </w:t>
+      </w:r>
+      <w:r>
+        <w:rPr>
+          <w:i/>
+        </w:rPr>
+        <w:t xml:space="preserve">23</w:t>
+      </w:r>
+      <w:r>
+        <w:t xml:space="preserve">(5), 938–944.</w:t>
+      </w:r>
+      <w:r>
+        <w:t xml:space="preserve"> </w:t>
+      </w:r>
+      <w:hyperlink r:id="rId118">
+        <w:r>
+          <w:rPr>
+            <w:rStyle w:val="Hyperlink"/>
+          </w:rPr>
+          <w:t xml:space="preserve">https://doi.org/10.1017/S1366728918001153</w:t>
+        </w:r>
+      </w:hyperlink>
+    </w:p>
+    <w:bookmarkEnd w:id="119"/>
+    <w:bookmarkStart w:id="121" w:name="ref-lisker_cross-language_1964"/>
     <w:p>
       <w:pPr>
         <w:pStyle w:val="Literaturverzeichnis"/>
@@ -7751,7 +7803,7 @@
       <w:r>
         <w:t xml:space="preserve"> </w:t>
       </w:r>
-      <w:hyperlink r:id="rId117">
+      <w:hyperlink r:id="rId120">
         <w:r>
           <w:rPr>
             <w:rStyle w:val="Hyperlink"/>
@@ -7760,8 +7812,8 @@
         </w:r>
       </w:hyperlink>
     </w:p>
-    <w:bookmarkEnd w:id="118"/>
-    <w:bookmarkStart w:id="119" w:name="ref-liu_effects_2019"/>
+    <w:bookmarkEnd w:id="121"/>
+    <w:bookmarkStart w:id="122" w:name="ref-liu_effects_2019"/>
     <w:p>
       <w:pPr>
         <w:pStyle w:val="Literaturverzeichnis"/>
@@ -7785,8 +7837,8 @@
         <w:t xml:space="preserve">(pp. 3750–3753). Melbourne, Australia: Canberra, Australia: Australasian Speech Science; Technology Association Inc.</w:t>
       </w:r>
     </w:p>
-    <w:bookmarkEnd w:id="119"/>
-    <w:bookmarkStart w:id="121" w:name="ref-llama_revisiting_2018"/>
+    <w:bookmarkEnd w:id="122"/>
+    <w:bookmarkStart w:id="124" w:name="ref-llama_revisiting_2018"/>
     <w:p>
       <w:pPr>
         <w:pStyle w:val="Literaturverzeichnis"/>
@@ -7821,7 +7873,7 @@
       <w:r>
         <w:t xml:space="preserve"> </w:t>
       </w:r>
-      <w:hyperlink r:id="rId120">
+      <w:hyperlink r:id="rId123">
         <w:r>
           <w:rPr>
             <w:rStyle w:val="Hyperlink"/>
@@ -7830,8 +7882,8 @@
         </w:r>
       </w:hyperlink>
     </w:p>
-    <w:bookmarkEnd w:id="121"/>
-    <w:bookmarkStart w:id="123" w:name="ref-llama_influence_2010"/>
+    <w:bookmarkEnd w:id="124"/>
+    <w:bookmarkStart w:id="126" w:name="ref-llama_influence_2010"/>
     <w:p>
       <w:pPr>
         <w:pStyle w:val="Literaturverzeichnis"/>
@@ -7866,7 +7918,7 @@
       <w:r>
         <w:t xml:space="preserve"> </w:t>
       </w:r>
-      <w:hyperlink r:id="rId122">
+      <w:hyperlink r:id="rId125">
         <w:r>
           <w:rPr>
             <w:rStyle w:val="Hyperlink"/>
@@ -7875,8 +7927,8 @@
         </w:r>
       </w:hyperlink>
     </w:p>
-    <w:bookmarkEnd w:id="123"/>
-    <w:bookmarkStart w:id="125" w:name="ref-lozano-arguelles_conceptually_2020"/>
+    <w:bookmarkEnd w:id="126"/>
+    <w:bookmarkStart w:id="128" w:name="ref-lozano-arguelles_conceptually_2020"/>
     <w:p>
       <w:pPr>
         <w:pStyle w:val="Literaturverzeichnis"/>
@@ -7899,7 +7951,7 @@
       <w:r>
         <w:t xml:space="preserve"> </w:t>
       </w:r>
-      <w:hyperlink r:id="rId124">
+      <w:hyperlink r:id="rId127">
         <w:r>
           <w:rPr>
             <w:rStyle w:val="Hyperlink"/>
@@ -7908,8 +7960,8 @@
         </w:r>
       </w:hyperlink>
     </w:p>
-    <w:bookmarkEnd w:id="125"/>
-    <w:bookmarkStart w:id="127" w:name="ref-meisel_transfer_1983"/>
+    <w:bookmarkEnd w:id="128"/>
+    <w:bookmarkStart w:id="130" w:name="ref-meisel_transfer_1983"/>
     <w:p>
       <w:pPr>
         <w:pStyle w:val="Literaturverzeichnis"/>
@@ -7944,7 +7996,7 @@
       <w:r>
         <w:t xml:space="preserve"> </w:t>
       </w:r>
-      <w:hyperlink r:id="rId126">
+      <w:hyperlink r:id="rId129">
         <w:r>
           <w:rPr>
             <w:rStyle w:val="Hyperlink"/>
@@ -7953,8 +8005,8 @@
         </w:r>
       </w:hyperlink>
     </w:p>
-    <w:bookmarkEnd w:id="127"/>
-    <w:bookmarkStart w:id="128" w:name="ref-paradis_neurolinguistic_2004"/>
+    <w:bookmarkEnd w:id="130"/>
+    <w:bookmarkStart w:id="131" w:name="ref-paradis_neurolinguistic_2004"/>
     <w:p>
       <w:pPr>
         <w:pStyle w:val="Literaturverzeichnis"/>
@@ -7975,8 +8027,8 @@
         <w:t xml:space="preserve">. Amsterdam ; Philadelphia: J. Benjamins Pub.</w:t>
       </w:r>
     </w:p>
-    <w:bookmarkEnd w:id="128"/>
-    <w:bookmarkStart w:id="130" w:name="ref-paradis_declarative_2009"/>
+    <w:bookmarkEnd w:id="131"/>
+    <w:bookmarkStart w:id="133" w:name="ref-paradis_declarative_2009"/>
     <w:p>
       <w:pPr>
         <w:pStyle w:val="Literaturverzeichnis"/>
@@ -8002,7 +8054,7 @@
       <w:r>
         <w:t xml:space="preserve"> </w:t>
       </w:r>
-      <w:hyperlink r:id="rId129">
+      <w:hyperlink r:id="rId132">
         <w:r>
           <w:rPr>
             <w:rStyle w:val="Hyperlink"/>
@@ -8011,8 +8063,8 @@
         </w:r>
       </w:hyperlink>
     </w:p>
-    <w:bookmarkEnd w:id="130"/>
-    <w:bookmarkStart w:id="132" w:name="ref-parma_cross-linguistic_2017"/>
+    <w:bookmarkEnd w:id="133"/>
+    <w:bookmarkStart w:id="135" w:name="ref-parma_cross-linguistic_2017"/>
     <w:p>
       <w:pPr>
         <w:pStyle w:val="Literaturverzeichnis"/>
@@ -8047,7 +8099,7 @@
       <w:r>
         <w:t xml:space="preserve"> </w:t>
       </w:r>
-      <w:hyperlink r:id="rId131">
+      <w:hyperlink r:id="rId134">
         <w:r>
           <w:rPr>
             <w:rStyle w:val="Hyperlink"/>
@@ -8056,8 +8108,8 @@
         </w:r>
       </w:hyperlink>
     </w:p>
-    <w:bookmarkEnd w:id="132"/>
-    <w:bookmarkStart w:id="134" w:name="ref-peirce_psychopy2_2019"/>
+    <w:bookmarkEnd w:id="135"/>
+    <w:bookmarkStart w:id="137" w:name="ref-peirce_psychopy2_2019"/>
     <w:p>
       <w:pPr>
         <w:pStyle w:val="Literaturverzeichnis"/>
@@ -8092,7 +8144,7 @@
       <w:r>
         <w:t xml:space="preserve"> </w:t>
       </w:r>
-      <w:hyperlink r:id="rId133">
+      <w:hyperlink r:id="rId136">
         <w:r>
           <w:rPr>
             <w:rStyle w:val="Hyperlink"/>
@@ -8101,8 +8153,8 @@
         </w:r>
       </w:hyperlink>
     </w:p>
-    <w:bookmarkEnd w:id="134"/>
-    <w:bookmarkStart w:id="136" w:name="ref-puig-mayenco_systematic_2020"/>
+    <w:bookmarkEnd w:id="137"/>
+    <w:bookmarkStart w:id="139" w:name="ref-puig-mayenco_systematic_2020"/>
     <w:p>
       <w:pPr>
         <w:pStyle w:val="Literaturverzeichnis"/>
@@ -8137,7 +8189,7 @@
       <w:r>
         <w:t xml:space="preserve"> </w:t>
       </w:r>
-      <w:hyperlink r:id="rId135">
+      <w:hyperlink r:id="rId138">
         <w:r>
           <w:rPr>
             <w:rStyle w:val="Hyperlink"/>
@@ -8146,8 +8198,41 @@
         </w:r>
       </w:hyperlink>
     </w:p>
-    <w:bookmarkEnd w:id="136"/>
-    <w:bookmarkStart w:id="138" w:name="ref-rothman_typological_2010"/>
+    <w:bookmarkEnd w:id="139"/>
+    <w:bookmarkStart w:id="141" w:name="ref-R-base"/>
+    <w:p>
+      <w:pPr>
+        <w:pStyle w:val="Literaturverzeichnis"/>
+      </w:pPr>
+      <w:r>
+        <w:t xml:space="preserve">R Core Team. (2018).</w:t>
+      </w:r>
+      <w:r>
+        <w:t xml:space="preserve"> </w:t>
+      </w:r>
+      <w:r>
+        <w:rPr>
+          <w:i/>
+        </w:rPr>
+        <w:t xml:space="preserve">R: A language and environment for statistical computing</w:t>
+      </w:r>
+      <w:r>
+        <w:t xml:space="preserve">. Vienna, Austria: R Foundation for Statistical Computing. Retrieved from</w:t>
+      </w:r>
+      <w:r>
+        <w:t xml:space="preserve"> </w:t>
+      </w:r>
+      <w:hyperlink r:id="rId140">
+        <w:r>
+          <w:rPr>
+            <w:rStyle w:val="Hyperlink"/>
+          </w:rPr>
+          <w:t xml:space="preserve">https://www.R-project.org/</w:t>
+        </w:r>
+      </w:hyperlink>
+    </w:p>
+    <w:bookmarkEnd w:id="141"/>
+    <w:bookmarkStart w:id="143" w:name="ref-rothman_typological_2010"/>
     <w:p>
       <w:pPr>
         <w:pStyle w:val="Literaturverzeichnis"/>
@@ -8182,7 +8267,7 @@
       <w:r>
         <w:t xml:space="preserve"> </w:t>
       </w:r>
-      <w:hyperlink r:id="rId137">
+      <w:hyperlink r:id="rId142">
         <w:r>
           <w:rPr>
             <w:rStyle w:val="Hyperlink"/>
@@ -8191,8 +8276,8 @@
         </w:r>
       </w:hyperlink>
     </w:p>
-    <w:bookmarkEnd w:id="138"/>
-    <w:bookmarkStart w:id="140" w:name="ref-rothman_l3_2011"/>
+    <w:bookmarkEnd w:id="143"/>
+    <w:bookmarkStart w:id="145" w:name="ref-rothman_l3_2011"/>
     <w:p>
       <w:pPr>
         <w:pStyle w:val="Literaturverzeichnis"/>
@@ -8227,7 +8312,7 @@
       <w:r>
         <w:t xml:space="preserve"> </w:t>
       </w:r>
-      <w:hyperlink r:id="rId139">
+      <w:hyperlink r:id="rId144">
         <w:r>
           <w:rPr>
             <w:rStyle w:val="Hyperlink"/>
@@ -8236,8 +8321,8 @@
         </w:r>
       </w:hyperlink>
     </w:p>
-    <w:bookmarkEnd w:id="140"/>
-    <w:bookmarkStart w:id="142" w:name="ref-baauw_cognitive_2013"/>
+    <w:bookmarkEnd w:id="145"/>
+    <w:bookmarkStart w:id="147" w:name="ref-baauw_cognitive_2013"/>
     <w:p>
       <w:pPr>
         <w:pStyle w:val="Literaturverzeichnis"/>
@@ -8263,7 +8348,7 @@
       <w:r>
         <w:t xml:space="preserve"> </w:t>
       </w:r>
-      <w:hyperlink r:id="rId141">
+      <w:hyperlink r:id="rId146">
         <w:r>
           <w:rPr>
             <w:rStyle w:val="Hyperlink"/>
@@ -8272,8 +8357,8 @@
         </w:r>
       </w:hyperlink>
     </w:p>
-    <w:bookmarkEnd w:id="142"/>
-    <w:bookmarkStart w:id="144" w:name="ref-rothman_linguistic_2015"/>
+    <w:bookmarkEnd w:id="147"/>
+    <w:bookmarkStart w:id="149" w:name="ref-rothman_linguistic_2015"/>
     <w:p>
       <w:pPr>
         <w:pStyle w:val="Literaturverzeichnis"/>
@@ -8308,7 +8393,7 @@
       <w:r>
         <w:t xml:space="preserve"> </w:t>
       </w:r>
-      <w:hyperlink r:id="rId143">
+      <w:hyperlink r:id="rId148">
         <w:r>
           <w:rPr>
             <w:rStyle w:val="Hyperlink"/>
@@ -8317,8 +8402,8 @@
         </w:r>
       </w:hyperlink>
     </w:p>
-    <w:bookmarkEnd w:id="144"/>
-    <w:bookmarkStart w:id="146" w:name="ref-slabakova_scalpel_2017"/>
+    <w:bookmarkEnd w:id="149"/>
+    <w:bookmarkStart w:id="151" w:name="ref-slabakova_scalpel_2017"/>
     <w:p>
       <w:pPr>
         <w:pStyle w:val="Literaturverzeichnis"/>
@@ -8353,7 +8438,7 @@
       <w:r>
         <w:t xml:space="preserve"> </w:t>
       </w:r>
-      <w:hyperlink r:id="rId145">
+      <w:hyperlink r:id="rId150">
         <w:r>
           <w:rPr>
             <w:rStyle w:val="Hyperlink"/>
@@ -8362,8 +8447,8 @@
         </w:r>
       </w:hyperlink>
     </w:p>
-    <w:bookmarkEnd w:id="146"/>
-    <w:bookmarkStart w:id="147" w:name="ref-tremblay_l2_2007"/>
+    <w:bookmarkEnd w:id="151"/>
+    <w:bookmarkStart w:id="152" w:name="ref-tremblay_l2_2007"/>
     <w:p>
       <w:pPr>
         <w:pStyle w:val="Literaturverzeichnis"/>
@@ -8372,8 +8457,8 @@
         <w:t xml:space="preserve">Tremblay, M. (2007). L2 influence on l3 pronunciation: Native-like VOT in the l3 japanese of english-french bilinguals. In. Presented at the Papers presented at the l3 phonology satellite workshop of ICPhS XVI, Freiburg, Germany.</w:t>
       </w:r>
     </w:p>
-    <w:bookmarkEnd w:id="147"/>
-    <w:bookmarkStart w:id="149" w:name="ref-ullman_contributions_2004"/>
+    <w:bookmarkEnd w:id="152"/>
+    <w:bookmarkStart w:id="154" w:name="ref-ullman_contributions_2004"/>
     <w:p>
       <w:pPr>
         <w:pStyle w:val="Literaturverzeichnis"/>
@@ -8408,7 +8493,7 @@
       <w:r>
         <w:t xml:space="preserve"> </w:t>
       </w:r>
-      <w:hyperlink r:id="rId148">
+      <w:hyperlink r:id="rId153">
         <w:r>
           <w:rPr>
             <w:rStyle w:val="Hyperlink"/>
@@ -8417,8 +8502,8 @@
         </w:r>
       </w:hyperlink>
     </w:p>
-    <w:bookmarkEnd w:id="149"/>
-    <w:bookmarkStart w:id="151" w:name="ref-westergaard_crosslinguistic_2017"/>
+    <w:bookmarkEnd w:id="154"/>
+    <w:bookmarkStart w:id="156" w:name="ref-westergaard_crosslinguistic_2017"/>
     <w:p>
       <w:pPr>
         <w:pStyle w:val="Literaturverzeichnis"/>
@@ -8453,7 +8538,7 @@
       <w:r>
         <w:t xml:space="preserve"> </w:t>
       </w:r>
-      <w:hyperlink r:id="rId150">
+      <w:hyperlink r:id="rId155">
         <w:r>
           <w:rPr>
             <w:rStyle w:val="Hyperlink"/>
@@ -8462,8 +8547,8 @@
         </w:r>
       </w:hyperlink>
     </w:p>
-    <w:bookmarkEnd w:id="151"/>
-    <w:bookmarkStart w:id="153" w:name="ref-williams_perception_1977"/>
+    <w:bookmarkEnd w:id="156"/>
+    <w:bookmarkStart w:id="158" w:name="ref-williams_perception_1977"/>
     <w:p>
       <w:pPr>
         <w:pStyle w:val="Literaturverzeichnis"/>
@@ -8498,7 +8583,7 @@
       <w:r>
         <w:t xml:space="preserve"> </w:t>
       </w:r>
-      <w:hyperlink r:id="rId152">
+      <w:hyperlink r:id="rId157">
         <w:r>
           <w:rPr>
             <w:rStyle w:val="Hyperlink"/>
@@ -8507,8 +8592,8 @@
         </w:r>
       </w:hyperlink>
     </w:p>
-    <w:bookmarkEnd w:id="153"/>
-    <w:bookmarkStart w:id="155" w:name="ref-wrembel_l2-accented_2010"/>
+    <w:bookmarkEnd w:id="158"/>
+    <w:bookmarkStart w:id="160" w:name="ref-wrembel_l2-accented_2010"/>
     <w:p>
       <w:pPr>
         <w:pStyle w:val="Literaturverzeichnis"/>
@@ -8543,7 +8628,7 @@
       <w:r>
         <w:t xml:space="preserve"> </w:t>
       </w:r>
-      <w:hyperlink r:id="rId154">
+      <w:hyperlink r:id="rId159">
         <w:r>
           <w:rPr>
             <w:rStyle w:val="Hyperlink"/>
@@ -8552,8 +8637,8 @@
         </w:r>
       </w:hyperlink>
     </w:p>
-    <w:bookmarkEnd w:id="155"/>
-    <w:bookmarkStart w:id="156" w:name="ref-wrembel_cross-linguistic_2011"/>
+    <w:bookmarkEnd w:id="160"/>
+    <w:bookmarkStart w:id="161" w:name="ref-wrembel_cross-linguistic_2011"/>
     <w:p>
       <w:pPr>
         <w:pStyle w:val="Literaturverzeichnis"/>
@@ -8577,8 +8662,8 @@
         <w:t xml:space="preserve">(pp. 2157–2160). Hong Kong: City University of Hong Kong.</w:t>
       </w:r>
     </w:p>
-    <w:bookmarkEnd w:id="156"/>
-    <w:bookmarkStart w:id="157" w:name="ref-wrembel_foreign_2012"/>
+    <w:bookmarkEnd w:id="161"/>
+    <w:bookmarkStart w:id="162" w:name="ref-wrembel_foreign_2012"/>
     <w:p>
       <w:pPr>
         <w:pStyle w:val="Literaturverzeichnis"/>
@@ -8602,18 +8687,33 @@
         <w:t xml:space="preserve">(pp. 281–309). Amsterdam: John Benjamins.</w:t>
       </w:r>
     </w:p>
-    <w:bookmarkEnd w:id="157"/>
-    <w:bookmarkStart w:id="158" w:name="ref-wrembel_vot_2014"/>
+    <w:bookmarkEnd w:id="162"/>
+    <w:bookmarkStart w:id="163" w:name="ref-wrembel_vot_2014"/>
     <w:p>
       <w:pPr>
         <w:pStyle w:val="Literaturverzeichnis"/>
       </w:pPr>
       <w:r>
-        <w:t xml:space="preserve">Wrembel, M. (2014). VOT patterns in the acquisition of third language phonology. In.</w:t>
-      </w:r>
-    </w:p>
-    <w:bookmarkEnd w:id="158"/>
-    <w:bookmarkStart w:id="159" w:name="ref-wrembel_search_2015"/>
+        <w:t xml:space="preserve">Wrembel, M. (2014). VOT patterns in the acquisition of third language phonology. In</w:t>
+      </w:r>
+      <w:r>
+        <w:t xml:space="preserve"> </w:t>
+      </w:r>
+      <w:r>
+        <w:rPr>
+          <w:i/>
+        </w:rPr>
+        <w:t xml:space="preserve">Proceedings of the international symposium on the acquisition of second language speech</w:t>
+      </w:r>
+      <w:r>
+        <w:t xml:space="preserve"> </w:t>
+      </w:r>
+      <w:r>
+        <w:t xml:space="preserve">(Vol. 5). COPAL.</w:t>
+      </w:r>
+    </w:p>
+    <w:bookmarkEnd w:id="163"/>
+    <w:bookmarkStart w:id="164" w:name="ref-wrembel_search_2015"/>
     <w:p>
       <w:pPr>
         <w:pStyle w:val="Literaturverzeichnis"/>
@@ -8634,8 +8734,8 @@
         <w:t xml:space="preserve">. Poznań: Wydawnictwo Naukowe UAM.</w:t>
       </w:r>
     </w:p>
-    <w:bookmarkEnd w:id="159"/>
-    <w:bookmarkStart w:id="161" w:name="ref-wrembel_multilingual_2020"/>
+    <w:bookmarkEnd w:id="164"/>
+    <w:bookmarkStart w:id="166" w:name="ref-wrembel_multilingual_2020"/>
     <w:p>
       <w:pPr>
         <w:pStyle w:val="Literaturverzeichnis"/>
@@ -8658,7 +8758,7 @@
       <w:r>
         <w:t xml:space="preserve"> </w:t>
       </w:r>
-      <w:hyperlink r:id="rId160">
+      <w:hyperlink r:id="rId165">
         <w:r>
           <w:rPr>
             <w:rStyle w:val="Hyperlink"/>
@@ -8667,8 +8767,8 @@
         </w:r>
       </w:hyperlink>
     </w:p>
-    <w:bookmarkEnd w:id="161"/>
-    <w:bookmarkStart w:id="163" w:name="ref-wrembel_cross-linguistic_2020"/>
+    <w:bookmarkEnd w:id="166"/>
+    <w:bookmarkStart w:id="168" w:name="ref-wrembel_cross-linguistic_2020"/>
     <w:p>
       <w:pPr>
         <w:pStyle w:val="Literaturverzeichnis"/>
@@ -8703,7 +8803,7 @@
       <w:r>
         <w:t xml:space="preserve"> </w:t>
       </w:r>
-      <w:hyperlink r:id="rId162">
+      <w:hyperlink r:id="rId167">
         <w:r>
           <w:rPr>
             <w:rStyle w:val="Hyperlink"/>
@@ -8712,8 +8812,8 @@
         </w:r>
       </w:hyperlink>
     </w:p>
-    <w:bookmarkEnd w:id="163"/>
-    <w:bookmarkStart w:id="164" w:name="ref-wunder_phonological_2010"/>
+    <w:bookmarkEnd w:id="168"/>
+    <w:bookmarkStart w:id="169" w:name="ref-wunder_phonological_2010"/>
     <w:p>
       <w:pPr>
         <w:pStyle w:val="Literaturverzeichnis"/>
@@ -8737,8 +8837,8 @@
         <w:t xml:space="preserve">(pp. 566–571). Poznań, Poland: Adam Mickiewicz University.: 6th International Symposium on the Acquisition of Second Language Speech, New Sounds 2010.</w:t>
       </w:r>
     </w:p>
-    <w:bookmarkEnd w:id="164"/>
-    <w:bookmarkEnd w:id="165"/>
+    <w:bookmarkEnd w:id="169"/>
+    <w:bookmarkEnd w:id="170"/>
     <w:sectPr>
       <w:headerReference w:type="even" r:id="rId10"/>
       <w:headerReference w:type="default" r:id="rId9"/>

</xml_diff>